<commit_message>
Ajout de Vytautas Razauskas et Arthur Stiliaras à la liste du tournoi
Co-Authored-By: Claude Opus 5.5 <noreply@anthropic.com>
Claude-Session: https://claude.ai/code/session_01KpLsLdXzpfpxoUwnN9efuy
</commit_message>
<xml_diff>
--- a/out/Liste_tournoi_Lambermont.docx
+++ b/out/Liste_tournoi_Lambermont.docx
@@ -1423,6 +1423,218 @@
                 <w:szCs w:val="22"/>
               </w:rPr>
               <w:t xml:space="preserve">-13 G2</w:t>
+            </w:r>
+          </w:p>
+        </w:tc>
+      </w:tr>
+      <w:tr>
+        <w:tc>
+          <w:tcPr>
+            <w:tcW w:type="dxa" w:w="700"/>
+            <w:tcMar>
+              <w:top w:type="dxa" w:w="80"/>
+              <w:left w:type="dxa" w:w="120"/>
+              <w:bottom w:type="dxa" w:w="80"/>
+              <w:right w:type="dxa" w:w="120"/>
+            </w:tcMar>
+          </w:tcPr>
+          <w:p>
+            <w:pPr>
+              <w:jc w:val="center"/>
+            </w:pPr>
+            <w:r>
+              <w:rPr>
+                <w:rFonts w:ascii="Calibri" w:cs="Calibri" w:eastAsia="Calibri" w:hAnsi="Calibri"/>
+                <w:b w:val="false"/>
+                <w:bCs w:val="false"/>
+                <w:sz w:val="22"/>
+                <w:szCs w:val="22"/>
+              </w:rPr>
+              <w:t xml:space="preserve">13</w:t>
+            </w:r>
+          </w:p>
+        </w:tc>
+        <w:tc>
+          <w:tcPr>
+            <w:tcW w:type="dxa" w:w="3800"/>
+            <w:tcMar>
+              <w:top w:type="dxa" w:w="80"/>
+              <w:left w:type="dxa" w:w="120"/>
+              <w:bottom w:type="dxa" w:w="80"/>
+              <w:right w:type="dxa" w:w="120"/>
+            </w:tcMar>
+          </w:tcPr>
+          <w:p>
+            <w:pPr>
+              <w:jc w:val="left"/>
+            </w:pPr>
+            <w:r>
+              <w:rPr>
+                <w:rFonts w:ascii="Calibri" w:cs="Calibri" w:eastAsia="Calibri" w:hAnsi="Calibri"/>
+                <w:b w:val="false"/>
+                <w:bCs w:val="false"/>
+                <w:sz w:val="22"/>
+                <w:szCs w:val="22"/>
+              </w:rPr>
+              <w:t xml:space="preserve">Vytautas RAZAUSKAS</w:t>
+            </w:r>
+          </w:p>
+        </w:tc>
+        <w:tc>
+          <w:tcPr>
+            <w:tcW w:type="dxa" w:w="1900"/>
+            <w:tcMar>
+              <w:top w:type="dxa" w:w="80"/>
+              <w:left w:type="dxa" w:w="120"/>
+              <w:bottom w:type="dxa" w:w="80"/>
+              <w:right w:type="dxa" w:w="120"/>
+            </w:tcMar>
+          </w:tcPr>
+          <w:p>
+            <w:pPr>
+              <w:jc w:val="center"/>
+            </w:pPr>
+            <w:r>
+              <w:rPr>
+                <w:rFonts w:ascii="Calibri" w:cs="Calibri" w:eastAsia="Calibri" w:hAnsi="Calibri"/>
+                <w:b w:val="false"/>
+                <w:bCs w:val="false"/>
+                <w:sz w:val="22"/>
+                <w:szCs w:val="22"/>
+              </w:rPr>
+              <w:t xml:space="preserve">1105028</w:t>
+            </w:r>
+          </w:p>
+        </w:tc>
+        <w:tc>
+          <w:tcPr>
+            <w:tcW w:type="dxa" w:w="2626"/>
+            <w:tcMar>
+              <w:top w:type="dxa" w:w="80"/>
+              <w:left w:type="dxa" w:w="120"/>
+              <w:bottom w:type="dxa" w:w="80"/>
+              <w:right w:type="dxa" w:w="120"/>
+            </w:tcMar>
+          </w:tcPr>
+          <w:p>
+            <w:pPr>
+              <w:jc w:val="center"/>
+            </w:pPr>
+            <w:r>
+              <w:rPr>
+                <w:rFonts w:ascii="Calibri" w:cs="Calibri" w:eastAsia="Calibri" w:hAnsi="Calibri"/>
+                <w:b w:val="false"/>
+                <w:bCs w:val="false"/>
+                <w:sz w:val="22"/>
+                <w:szCs w:val="22"/>
+              </w:rPr>
+              <w:t xml:space="preserve">M2</w:t>
+            </w:r>
+          </w:p>
+        </w:tc>
+      </w:tr>
+      <w:tr>
+        <w:tc>
+          <w:tcPr>
+            <w:tcW w:type="dxa" w:w="700"/>
+            <w:tcMar>
+              <w:top w:type="dxa" w:w="80"/>
+              <w:left w:type="dxa" w:w="120"/>
+              <w:bottom w:type="dxa" w:w="80"/>
+              <w:right w:type="dxa" w:w="120"/>
+            </w:tcMar>
+          </w:tcPr>
+          <w:p>
+            <w:pPr>
+              <w:jc w:val="center"/>
+            </w:pPr>
+            <w:r>
+              <w:rPr>
+                <w:rFonts w:ascii="Calibri" w:cs="Calibri" w:eastAsia="Calibri" w:hAnsi="Calibri"/>
+                <w:b w:val="false"/>
+                <w:bCs w:val="false"/>
+                <w:sz w:val="22"/>
+                <w:szCs w:val="22"/>
+              </w:rPr>
+              <w:t xml:space="preserve">14</w:t>
+            </w:r>
+          </w:p>
+        </w:tc>
+        <w:tc>
+          <w:tcPr>
+            <w:tcW w:type="dxa" w:w="3800"/>
+            <w:tcMar>
+              <w:top w:type="dxa" w:w="80"/>
+              <w:left w:type="dxa" w:w="120"/>
+              <w:bottom w:type="dxa" w:w="80"/>
+              <w:right w:type="dxa" w:w="120"/>
+            </w:tcMar>
+          </w:tcPr>
+          <w:p>
+            <w:pPr>
+              <w:jc w:val="left"/>
+            </w:pPr>
+            <w:r>
+              <w:rPr>
+                <w:rFonts w:ascii="Calibri" w:cs="Calibri" w:eastAsia="Calibri" w:hAnsi="Calibri"/>
+                <w:b w:val="false"/>
+                <w:bCs w:val="false"/>
+                <w:sz w:val="22"/>
+                <w:szCs w:val="22"/>
+              </w:rPr>
+              <w:t xml:space="preserve">Arthur STILIARAS</w:t>
+            </w:r>
+          </w:p>
+        </w:tc>
+        <w:tc>
+          <w:tcPr>
+            <w:tcW w:type="dxa" w:w="1900"/>
+            <w:tcMar>
+              <w:top w:type="dxa" w:w="80"/>
+              <w:left w:type="dxa" w:w="120"/>
+              <w:bottom w:type="dxa" w:w="80"/>
+              <w:right w:type="dxa" w:w="120"/>
+            </w:tcMar>
+          </w:tcPr>
+          <w:p>
+            <w:pPr>
+              <w:jc w:val="center"/>
+            </w:pPr>
+            <w:r>
+              <w:rPr>
+                <w:rFonts w:ascii="Calibri" w:cs="Calibri" w:eastAsia="Calibri" w:hAnsi="Calibri"/>
+                <w:b w:val="false"/>
+                <w:bCs w:val="false"/>
+                <w:sz w:val="22"/>
+                <w:szCs w:val="22"/>
+              </w:rPr>
+              <w:t xml:space="preserve">1108184</w:t>
+            </w:r>
+          </w:p>
+        </w:tc>
+        <w:tc>
+          <w:tcPr>
+            <w:tcW w:type="dxa" w:w="2626"/>
+            <w:tcMar>
+              <w:top w:type="dxa" w:w="80"/>
+              <w:left w:type="dxa" w:w="120"/>
+              <w:bottom w:type="dxa" w:w="80"/>
+              <w:right w:type="dxa" w:w="120"/>
+            </w:tcMar>
+          </w:tcPr>
+          <w:p>
+            <w:pPr>
+              <w:jc w:val="center"/>
+            </w:pPr>
+            <w:r>
+              <w:rPr>
+                <w:rFonts w:ascii="Calibri" w:cs="Calibri" w:eastAsia="Calibri" w:hAnsi="Calibri"/>
+                <w:b w:val="false"/>
+                <w:bCs w:val="false"/>
+                <w:sz w:val="22"/>
+                <w:szCs w:val="22"/>
+              </w:rPr>
+              <w:t xml:space="preserve">-15 G3</w:t>
             </w:r>
           </w:p>
         </w:tc>

</xml_diff>